<commit_message>
Cyber security threat protection project is incomplete but ended
</commit_message>
<xml_diff>
--- a/Capstone 1/Fraud Detection Architecture.docx
+++ b/Capstone 1/Fraud Detection Architecture.docx
@@ -979,14 +979,7 @@
           <w:b/>
           <w:bCs/>
         </w:rPr>
-        <w:t xml:space="preserve"> </w:t>
-      </w:r>
-      <w:r>
-        <w:rPr>
-          <w:b/>
-          <w:bCs/>
-        </w:rPr>
-        <w:t>Why Isolation Forest?</w:t>
+        <w:t xml:space="preserve"> Why Isolation Forest?</w:t>
       </w:r>
     </w:p>
     <w:p>
@@ -1598,27 +1591,7 @@
           <w:szCs w:val="32"/>
         </w:rPr>
         <w:lastRenderedPageBreak/>
-        <w:t>7</w:t>
-      </w:r>
-      <w:r>
-        <w:rPr>
-          <w:b/>
-          <w:bCs/>
-          <w:color w:val="0070C0"/>
-          <w:sz w:val="32"/>
-          <w:szCs w:val="32"/>
-        </w:rPr>
-        <w:t xml:space="preserve">. </w:t>
-      </w:r>
-      <w:r>
-        <w:rPr>
-          <w:b/>
-          <w:bCs/>
-          <w:color w:val="0070C0"/>
-          <w:sz w:val="32"/>
-          <w:szCs w:val="32"/>
-        </w:rPr>
-        <w:t>Testing &amp; Validation</w:t>
+        <w:t>7. Testing &amp; Validation</w:t>
       </w:r>
     </w:p>
     <w:p>
@@ -1871,6 +1844,73 @@
       <w:r>
         <w:t>, making the system both operationally efficient and analytically powerful.</w:t>
       </w:r>
+    </w:p>
+    <w:p/>
+    <w:p>
+      <w:pPr>
+        <w:rPr>
+          <w:b/>
+          <w:bCs/>
+          <w:color w:val="0070C0"/>
+          <w:sz w:val="32"/>
+          <w:szCs w:val="32"/>
+        </w:rPr>
+      </w:pPr>
+    </w:p>
+    <w:p>
+      <w:pPr>
+        <w:rPr>
+          <w:b/>
+          <w:bCs/>
+          <w:color w:val="0070C0"/>
+          <w:sz w:val="32"/>
+          <w:szCs w:val="32"/>
+        </w:rPr>
+      </w:pPr>
+      <w:r>
+        <w:rPr>
+          <w:b/>
+          <w:bCs/>
+          <w:color w:val="0070C0"/>
+          <w:sz w:val="32"/>
+          <w:szCs w:val="32"/>
+        </w:rPr>
+        <w:lastRenderedPageBreak/>
+        <w:t>Interactive UI Working VIDEO</w:t>
+      </w:r>
+    </w:p>
+    <w:p/>
+    <w:p>
+      <w:hyperlink r:id="rId8" w:history="1">
+        <w:r>
+          <w:rPr>
+            <w:rStyle w:val="Hyperlink"/>
+          </w:rPr>
+          <w:t>https://drive.google.com/file/d/1yn3hepJ-rjzQTEx-SUs5z2Q6kuf--vI3/</w:t>
+        </w:r>
+        <w:proofErr w:type="spellStart"/>
+        <w:r>
+          <w:rPr>
+            <w:rStyle w:val="Hyperlink"/>
+          </w:rPr>
+          <w:t>view?usp</w:t>
+        </w:r>
+        <w:proofErr w:type="spellEnd"/>
+        <w:r>
+          <w:rPr>
+            <w:rStyle w:val="Hyperlink"/>
+          </w:rPr>
+          <w:t>=</w:t>
+        </w:r>
+        <w:proofErr w:type="spellStart"/>
+        <w:r>
+          <w:rPr>
+            <w:rStyle w:val="Hyperlink"/>
+          </w:rPr>
+          <w:t>drive_link</w:t>
+        </w:r>
+        <w:proofErr w:type="spellEnd"/>
+      </w:hyperlink>
     </w:p>
     <w:sectPr>
       <w:pgSz w:w="11906" w:h="16838"/>
@@ -4698,6 +4738,7 @@
   <w:style w:type="character" w:default="1" w:styleId="DefaultParagraphFont">
     <w:name w:val="Default Paragraph Font"/>
     <w:uiPriority w:val="1"/>
+    <w:semiHidden/>
     <w:unhideWhenUsed/>
   </w:style>
   <w:style w:type="table" w:default="1" w:styleId="TableNormal">
@@ -5030,6 +5071,29 @@
       </w:tblBorders>
     </w:tblPr>
   </w:style>
+  <w:style w:type="character" w:styleId="Hyperlink">
+    <w:name w:val="Hyperlink"/>
+    <w:basedOn w:val="DefaultParagraphFont"/>
+    <w:uiPriority w:val="99"/>
+    <w:unhideWhenUsed/>
+    <w:rsid w:val="009C61BB"/>
+    <w:rPr>
+      <w:color w:val="467886" w:themeColor="hyperlink"/>
+      <w:u w:val="single"/>
+    </w:rPr>
+  </w:style>
+  <w:style w:type="character" w:styleId="UnresolvedMention">
+    <w:name w:val="Unresolved Mention"/>
+    <w:basedOn w:val="DefaultParagraphFont"/>
+    <w:uiPriority w:val="99"/>
+    <w:semiHidden/>
+    <w:unhideWhenUsed/>
+    <w:rsid w:val="009C61BB"/>
+    <w:rPr>
+      <w:color w:val="605E5C"/>
+      <w:shd w:val="clear" w:color="auto" w:fill="E1DFDD"/>
+    </w:rPr>
+  </w:style>
 </w:styles>
 </file>
 
@@ -5358,4 +5422,10 @@
     <ds:schemaRef ds:uri="http://schemas.openxmlformats.org/officeDocument/2006/bibliography"/>
   </ds:schemaRefs>
 </ds:datastoreItem>
+</file>
+
+<file path=docMetadata/LabelInfo.xml><?xml version="1.0" encoding="utf-8"?>
+<clbl:labelList xmlns:clbl="http://schemas.microsoft.com/office/2020/mipLabelMetadata">
+  <clbl:label id="{e760c494-6550-44b4-8258-77c175d778b7}" enabled="1" method="Privileged" siteId="{76a2ae5a-9f00-4f6b-95ed-5d33d77c4d61}" removed="0"/>
+</clbl:labelList>
 </file>
</xml_diff>